<commit_message>
Fix punctuation and formatting in science and language documents.
</commit_message>
<xml_diff>
--- a/Received/four/4, science.docx
+++ b/Received/four/4, science.docx
@@ -3020,7 +3020,17 @@
           <w:lang w:bidi="ar-SA"/>
         </w:rPr>
         <w:br/>
-        <w:t>(c) Write any two characteristics of magnet?</w:t>
+        <w:t>(c) Write any two characteristics of magnet</w:t>
+      </w:r>
+      <w:r>
+        <w:rPr>
+          <w:rFonts w:ascii="Times New Roman" w:eastAsia="Times New Roman" w:hAnsi="Times New Roman" w:cs="Times New Roman"/>
+          <w:color w:val="0A0A0A"/>
+          <w:sz w:val="24"/>
+          <w:szCs w:val="24"/>
+          <w:lang w:bidi="ar-SA"/>
+        </w:rPr>
+        <w:t>.</w:t>
       </w:r>
       <w:r>
         <w:rPr>
@@ -3062,7 +3072,17 @@
           <w:lang w:bidi="ar-SA"/>
         </w:rPr>
         <w:br/>
-        <w:t>(e) Write any two forms of energy?</w:t>
+        <w:t>(e) Write any two forms of energy</w:t>
+      </w:r>
+      <w:r>
+        <w:rPr>
+          <w:rFonts w:ascii="Times New Roman" w:eastAsia="Times New Roman" w:hAnsi="Times New Roman" w:cs="Times New Roman"/>
+          <w:color w:val="0A0A0A"/>
+          <w:sz w:val="24"/>
+          <w:szCs w:val="24"/>
+          <w:lang w:bidi="ar-SA"/>
+        </w:rPr>
+        <w:t>.</w:t>
       </w:r>
       <w:r>
         <w:rPr>
@@ -3192,17 +3212,39 @@
           <w:szCs w:val="24"/>
           <w:lang w:bidi="ar-SA"/>
         </w:rPr>
-        <w:t xml:space="preserve">          </w:t>
-      </w:r>
-      <w:r>
-        <w:rPr>
-          <w:rFonts w:ascii="Times New Roman" w:eastAsia="Times New Roman" w:hAnsi="Times New Roman" w:cs="Times New Roman"/>
-          <w:color w:val="0A0A0A"/>
-          <w:sz w:val="24"/>
-          <w:szCs w:val="24"/>
-          <w:lang w:bidi="ar-SA"/>
-        </w:rPr>
-        <w:t>(ii) Freezing</w:t>
+        <w:t xml:space="preserve">       </w:t>
+      </w:r>
+      <w:proofErr w:type="gramStart"/>
+      <w:r>
+        <w:rPr>
+          <w:rFonts w:ascii="Times New Roman" w:eastAsia="Times New Roman" w:hAnsi="Times New Roman" w:cs="Times New Roman"/>
+          <w:color w:val="0A0A0A"/>
+          <w:sz w:val="24"/>
+          <w:szCs w:val="24"/>
+          <w:lang w:bidi="ar-SA"/>
+        </w:rPr>
+        <w:t xml:space="preserve">   </w:t>
+      </w:r>
+      <w:r>
+        <w:rPr>
+          <w:rFonts w:ascii="Times New Roman" w:eastAsia="Times New Roman" w:hAnsi="Times New Roman" w:cs="Times New Roman"/>
+          <w:color w:val="0A0A0A"/>
+          <w:sz w:val="24"/>
+          <w:szCs w:val="24"/>
+          <w:lang w:bidi="ar-SA"/>
+        </w:rPr>
+        <w:t>(</w:t>
+      </w:r>
+      <w:proofErr w:type="gramEnd"/>
+      <w:r>
+        <w:rPr>
+          <w:rFonts w:ascii="Times New Roman" w:eastAsia="Times New Roman" w:hAnsi="Times New Roman" w:cs="Times New Roman"/>
+          <w:color w:val="0A0A0A"/>
+          <w:sz w:val="24"/>
+          <w:szCs w:val="24"/>
+          <w:lang w:bidi="ar-SA"/>
+        </w:rPr>
+        <w:t>ii) Freezing</w:t>
       </w:r>
     </w:p>
     <w:p>

</xml_diff>